<commit_message>
Introduction: soften over-definite framing of prior findings
The background read as if it were settling the results. Recast the
disaggregated observations as reported prior evidence rather than
established fact: "diagnosed at younger ages" -> "has been reported at
younger ages"; "the lowest rates fall among" -> "some of the lowest
reported rates are among"; "incidence differs / varies" -> "has been
reported to differ / to vary"; "understates their true incidence" -> "can
understate their incidence"; and "subtype rearranges the order ... which
group ranks highest depends on the tumor being counted" -> "subtype may
reorder the groups ... the group with the highest rate can depend on the
subtype considered." Cited figures and named studies are kept; only the
certainty of the verbs is dialed back. Rebuild the manuscript docx;
crosscheck A-H PASS.

Co-Authored-By: Claude Opus 4.8 <noreply@anthropic.com>
Claude-Session: https://claude.ai/code/session_01CuLT4FKRBtsU22Vwfjj2qn
</commit_message>
<xml_diff>
--- a/meta_agents/search_v2/outputs/Manuscript_Full.docx
+++ b/meta_agents/search_v2/outputs/Manuscript_Full.docx
@@ -224,7 +224,7 @@
           <w:sz w:val="24"/>
           <w:szCs w:val="24"/>
         </w:rPr>
-        <w:t xml:space="preserve"> and their tumors, like those in several other minority groups, are diagnosed at younger ages than in NHW women.</w:t>
+        <w:t xml:space="preserve"> and in several minority groups breast cancer has been reported at younger ages at diagnosis than in NHW women.</w:t>
       </w:r>
       <w:r>
         <w:rPr>
@@ -267,7 +267,7 @@
           <w:sz w:val="24"/>
           <w:szCs w:val="24"/>
         </w:rPr>
-        <w:t xml:space="preserve"> reported an incidence of 146 per 100,000 in NHW women and, within Asian American women, a more-than-twofold spread across ethnic groups—from about 103 per 100,000 in Japanese to 46 in Korean women—that widened with US nativity, the rate in US-born Filipina women surpassing that of NHW women. The lowest rates fall among Southeast Asian groups such as the Hmong,</w:t>
+        <w:t xml:space="preserve"> reported an incidence of 146 per 100,000 in NHW women and, within Asian American women, a more-than-twofold spread across ethnic groups—from about 103 per 100,000 in Japanese to 46 in Korean women—that widened with US nativity, the rate in US-born Filipina women surpassing that of NHW women. Some of the lowest reported rates are among Southeast Asian groups such as the Hmong,</w:t>
       </w:r>
       <w:r>
         <w:rPr>
@@ -286,7 +286,7 @@
           <w:sz w:val="24"/>
           <w:szCs w:val="24"/>
         </w:rPr>
-        <w:t xml:space="preserve"> and rates differ again across the individual Asian ethnicities followed over time.</w:t>
+        <w:t xml:space="preserve"> and rates have differed again across the individual Asian ethnicities followed over time.</w:t>
       </w:r>
       <w:r>
         <w:rPr>
@@ -305,7 +305,7 @@
           <w:sz w:val="24"/>
           <w:szCs w:val="24"/>
         </w:rPr>
-        <w:t xml:space="preserve"> Hispanic/Latina women are not one group either: incidence differs by country of origin,</w:t>
+        <w:t xml:space="preserve"> Hispanic/Latina women are not one group either: incidence has been reported to differ by country of origin,</w:t>
       </w:r>
       <w:r>
         <w:rPr>
@@ -324,7 +324,7 @@
           <w:sz w:val="24"/>
           <w:szCs w:val="24"/>
         </w:rPr>
-        <w:t xml:space="preserve"> and among California Hispanic women it varies further with nativity and neighborhood.</w:t>
+        <w:t xml:space="preserve"> and among California Hispanic women to vary further with nativity and neighborhood.</w:t>
       </w:r>
       <w:r>
         <w:rPr>
@@ -343,7 +343,7 @@
           <w:sz w:val="24"/>
           <w:szCs w:val="24"/>
         </w:rPr>
-        <w:t xml:space="preserve"> For American Indian and Alaska Native (AI/AN) women, the aggregate rate also depends on how race is ascertained: registries that assign race by observation misclassify and undercount many AI/AN cases, so an unlinked-registry rate understates their true incidence.</w:t>
+        <w:t xml:space="preserve"> For American Indian and Alaska Native (AI/AN) women, the aggregate rate also depends on how race is ascertained: registries that assign race by observation misclassify and undercount many AI/AN cases, so an unlinked-registry rate can understate their incidence.</w:t>
       </w:r>
       <w:r>
         <w:rPr>
@@ -362,7 +362,7 @@
           <w:sz w:val="24"/>
           <w:szCs w:val="24"/>
         </w:rPr>
-        <w:t xml:space="preserve"> Subtype rearranges the order once more: NHW women have the highest rate of HR+/HER2− disease while NHB women have the highest rate of TNBC,</w:t>
+        <w:t xml:space="preserve"> Subtype may reorder the groups again: NHW women have been reported to have the highest rate of HR+/HER2− disease and NHB women the highest rate of TNBC,</w:t>
       </w:r>
       <w:r>
         <w:rPr>
@@ -381,7 +381,7 @@
           <w:sz w:val="24"/>
           <w:szCs w:val="24"/>
         </w:rPr>
-        <w:t xml:space="preserve"> so which group ranks highest depends on the tumor being counted.</w:t>
+        <w:t xml:space="preserve"> so the group with the highest rate can depend on the subtype considered.</w:t>
       </w:r>
     </w:p>
     <w:p>

</xml_diff>

<commit_message>
Revert Introduction wording; drop "mask" from abstract background
Restore the Introduction to its original wording (the softening belonged
to the abstract background, not here). In the abstract background, keep the
softer "may not reflect" but replace "these categories can mask
heterogeneity" with plain wording: "each category groups several subgroups
defined by ...". Rebuild docx; crosscheck A-H PASS.

Co-Authored-By: Claude Opus 4.8 <noreply@anthropic.com>
Claude-Session: https://claude.ai/code/session_01CuLT4FKRBtsU22Vwfjj2qn
</commit_message>
<xml_diff>
--- a/meta_agents/search_v2/outputs/Manuscript_Full.docx
+++ b/meta_agents/search_v2/outputs/Manuscript_Full.docx
@@ -60,7 +60,7 @@
           <w:sz w:val="24"/>
           <w:szCs w:val="24"/>
         </w:rPr>
-        <w:t xml:space="preserve"> In the United States, breast cancer incidence is usually reported for broad racial and ethnic categories. These categories can mask heterogeneity—subgroups defined by ancestry, nativity, and region, with receptor-defined subtypes cutting across them—so an aggregate rate may not reflect which subgroups are at highest and lowest risk. Estimates for these subgroups are scattered across separate cancer-registry studies that differ in populations, periods, and reference groups, and are not readily comparable across the published literature.</w:t>
+        <w:t xml:space="preserve"> In the United States, breast cancer incidence is usually reported for broad racial and ethnic categories. Each category groups several subgroups defined by ancestry, nativity, and region, with receptor-defined subtypes cutting across them, so an aggregate rate may not reflect which subgroups are at highest and lowest risk. Estimates for these subgroups are scattered across separate cancer-registry studies that differ in populations, periods, and reference groups, and are not readily comparable across the published literature.</w:t>
       </w:r>
     </w:p>
     <w:p>
@@ -224,7 +224,7 @@
           <w:sz w:val="24"/>
           <w:szCs w:val="24"/>
         </w:rPr>
-        <w:t xml:space="preserve"> and in several minority groups breast cancer has been reported at younger ages at diagnosis than in NHW women.</w:t>
+        <w:t xml:space="preserve"> and their tumors, like those in several other minority groups, are diagnosed at younger ages than in NHW women.</w:t>
       </w:r>
       <w:r>
         <w:rPr>
@@ -267,7 +267,7 @@
           <w:sz w:val="24"/>
           <w:szCs w:val="24"/>
         </w:rPr>
-        <w:t xml:space="preserve"> reported an incidence of 146 per 100,000 in NHW women and, within Asian American women, a more-than-twofold spread across ethnic groups—from about 103 per 100,000 in Japanese to 46 in Korean women—that widened with US nativity, the rate in US-born Filipina women surpassing that of NHW women. Some of the lowest reported rates are among Southeast Asian groups such as the Hmong,</w:t>
+        <w:t xml:space="preserve"> reported an incidence of 146 per 100,000 in NHW women and, within Asian American women, a more-than-twofold spread across ethnic groups—from about 103 per 100,000 in Japanese to 46 in Korean women—that widened with US nativity, the rate in US-born Filipina women surpassing that of NHW women. The lowest rates fall among Southeast Asian groups such as the Hmong,</w:t>
       </w:r>
       <w:r>
         <w:rPr>
@@ -286,7 +286,7 @@
           <w:sz w:val="24"/>
           <w:szCs w:val="24"/>
         </w:rPr>
-        <w:t xml:space="preserve"> and rates have differed again across the individual Asian ethnicities followed over time.</w:t>
+        <w:t xml:space="preserve"> and rates differ again across the individual Asian ethnicities followed over time.</w:t>
       </w:r>
       <w:r>
         <w:rPr>
@@ -305,7 +305,7 @@
           <w:sz w:val="24"/>
           <w:szCs w:val="24"/>
         </w:rPr>
-        <w:t xml:space="preserve"> Hispanic/Latina women are not one group either: incidence has been reported to differ by country of origin,</w:t>
+        <w:t xml:space="preserve"> Hispanic/Latina women are not one group either: incidence differs by country of origin,</w:t>
       </w:r>
       <w:r>
         <w:rPr>
@@ -324,7 +324,7 @@
           <w:sz w:val="24"/>
           <w:szCs w:val="24"/>
         </w:rPr>
-        <w:t xml:space="preserve"> and among California Hispanic women to vary further with nativity and neighborhood.</w:t>
+        <w:t xml:space="preserve"> and among California Hispanic women it varies further with nativity and neighborhood.</w:t>
       </w:r>
       <w:r>
         <w:rPr>
@@ -343,7 +343,7 @@
           <w:sz w:val="24"/>
           <w:szCs w:val="24"/>
         </w:rPr>
-        <w:t xml:space="preserve"> For American Indian and Alaska Native (AI/AN) women, the aggregate rate also depends on how race is ascertained: registries that assign race by observation misclassify and undercount many AI/AN cases, so an unlinked-registry rate could understate their true incidence.</w:t>
+        <w:t xml:space="preserve"> For American Indian and Alaska Native (AI/AN) women, the aggregate rate also depends on how race is ascertained: registries that assign race by observation misclassify and undercount many AI/AN cases, so an unlinked-registry rate understates their true incidence.</w:t>
       </w:r>
       <w:r>
         <w:rPr>
@@ -362,7 +362,7 @@
           <w:sz w:val="24"/>
           <w:szCs w:val="24"/>
         </w:rPr>
-        <w:t xml:space="preserve"> Subtype may reorder the groups again: NHW women have been reported to have the highest rate of HR+/HER2− disease and NHB women the highest rate of TNBC,</w:t>
+        <w:t xml:space="preserve"> Subtype rearranges the order once more: NHW women have the highest rate of HR+/HER2− disease while NHB women have the highest rate of TNBC,</w:t>
       </w:r>
       <w:r>
         <w:rPr>
@@ -381,7 +381,7 @@
           <w:sz w:val="24"/>
           <w:szCs w:val="24"/>
         </w:rPr>
-        <w:t xml:space="preserve"> so the group with the highest rate can depend on the subtype considered.</w:t>
+        <w:t xml:space="preserve"> so which group ranks highest depends on the tumor being counted.</w:t>
       </w:r>
     </w:p>
     <w:p>

</xml_diff>

<commit_message>
Split the long Selection paragraph and clarify the AI/AN priority clause
- Broke the single "Selection of a representative" paragraph into three:
  general selection rule; AI/AN ascertainment override; independence check
  and the four sensitivity analyses.
- Reworded the dangling "ahead of both the coverage and the comparator-
  type preferences" to "this ascertainment preference took priority over
  the coverage and comparator-type criteria above", so it is clear the IHS
  preference outranks those two earlier criteria.
Reassembled and rebuilt the docx; crosscheck A-H all pass.

Co-Authored-By: Claude Opus 4.8 <noreply@anthropic.com>
Claude-Session: https://claude.ai/code/session_01CuLT4FKRBtsU22Vwfjj2qn
</commit_message>
<xml_diff>
--- a/meta_agents/search_v2/outputs/Manuscript_Full.docx
+++ b/meta_agents/search_v2/outputs/Manuscript_Full.docx
@@ -742,7 +742,35 @@
           <w:sz w:val="24"/>
           <w:szCs w:val="24"/>
         </w:rPr>
-        <w:t xml:space="preserve"> was selected for each cell. Each estimate was assigned to a registry "family," and the registry family, group, analytic dimension, comparator, diagnosis period, and standard population of each estimate were tabulated so that overlaps within a cell could be seen (Supplementary Table 4). Within a cell, the representative was chosen by applying, in order: the broadest population coverage (USCS &gt; NAACCR &gt; SEER-national &gt; state or regional), then a NHW (rather than an unstratified White) comparator, then the most recent and longest diagnosis period, a clearly documented age-standardization, and a directly reported confidence interval where available. Where a cell had no NHW-comparator source—the receptor-defined subtype cells and two age-specific Black cells—the estimate using an unstratified White comparator was kept as the representative and marked †. For AI/AN populations this order was overridden in favour of ascertainment validity: because unlinked registries tend to undercount this population, an estimate with Indian Health Service–based ascertainment—the IHS-PRCDA linkage, or a dedicated registry such as the Alaska Native Tumor Registry—was preferred over an unlinked-registry estimate for the same cell, ahead of both the coverage and the comparator-type preferences. For Alaska Native women, for example, this ascertainment-preferred source—the IHS-eligibility-based Alaska Native Tumor Registry—reports against an unstratified White reference rather than NHW; it was kept as the representative because completeness of ascertainment took priority over comparator type, and its NHW-comparator alternative was carried in the sensitivity analysis. Overall, disaggregated-subgroup, subtype, and age-specific results could draw on different studies, but the same registry data were not entered twice for the same question. The stability of the selection was checked in four ways: restricting to studies at low risk of bias, to directly reported (rather than computed) estimates, to estimates with an NHW (rather than unstratified White) comparator, and to estimates standardized to the 2000 U.S. standard population (Supplementary Table 6).</w:t>
+        <w:t xml:space="preserve"> was selected for each cell. Each estimate was assigned to a registry "family," and the registry family, group, analytic dimension, comparator, diagnosis period, and standard population of each estimate were tabulated so that overlaps within a cell could be seen (Supplementary Table 4). Within a cell, the representative was chosen by applying, in order: the broadest population coverage (USCS &gt; NAACCR &gt; SEER-national &gt; state or regional), then a NHW (rather than an unstratified White) comparator, then the most recent and longest diagnosis period, a clearly documented age-standardization, and a directly reported confidence interval where available. Where a cell had no NHW-comparator source—the receptor-defined subtype cells and two age-specific Black cells—the estimate using an unstratified White comparator was kept as the representative and marked †.</w:t>
+      </w:r>
+    </w:p>
+    <w:p>
+      <w:pPr>
+        <w:spacing w:after="160" w:line="360"/>
+      </w:pPr>
+      <w:r>
+        <w:rPr>
+          <w:rFonts w:ascii="Times New Roman" w:cs="Times New Roman" w:eastAsia="Times New Roman" w:hAnsi="Times New Roman"/>
+          <w:color w:val="000000"/>
+          <w:sz w:val="24"/>
+          <w:szCs w:val="24"/>
+        </w:rPr>
+        <w:t xml:space="preserve">For AI/AN populations this order was overridden in favour of ascertainment validity: because unlinked registries tend to undercount this population, an estimate with Indian Health Service–based ascertainment—the IHS-PRCDA linkage, or a dedicated registry such as the Alaska Native Tumor Registry—was preferred over an unlinked-registry estimate for the same cell; this ascertainment preference took priority over the coverage and comparator-type criteria above. For Alaska Native women, for example, this ascertainment-preferred source—the IHS-eligibility-based Alaska Native Tumor Registry—reports against an unstratified White reference rather than NHW; it was kept as the representative because completeness of ascertainment took priority over comparator type, and its NHW-comparator alternative was carried in the sensitivity analysis.</w:t>
+      </w:r>
+    </w:p>
+    <w:p>
+      <w:pPr>
+        <w:spacing w:after="160" w:line="360"/>
+      </w:pPr>
+      <w:r>
+        <w:rPr>
+          <w:rFonts w:ascii="Times New Roman" w:cs="Times New Roman" w:eastAsia="Times New Roman" w:hAnsi="Times New Roman"/>
+          <w:color w:val="000000"/>
+          <w:sz w:val="24"/>
+          <w:szCs w:val="24"/>
+        </w:rPr>
+        <w:t xml:space="preserve">Overall, disaggregated-subgroup, subtype, and age-specific results could draw on different studies, but the same registry data were not entered twice for the same question. The stability of the selection was checked in four ways: restricting to studies at low risk of bias, to directly reported (rather than computed) estimates, to estimates with an NHW (rather than unstratified White) comparator, and to estimates standardized to the 2000 U.S. standard population (Supplementary Table 6).</w:t>
       </w:r>
     </w:p>
     <w:p>

</xml_diff>

<commit_message>
Tidy Alaska example and de-duplicate the pooling rationale in Methods
- Alaska Native example: split the long semicolon/dash sentence into three
  and pluralized "alternatives" (Wingo, Melkonian 2019/2021 all carried in
  sensitivity).
- Statistical analysis: the "primary result for each group is the
  representative population-based estimate" clause restated the Selection
  section (which already defines the analytic cell and its one
  representative). Since this sentence opens "For the non-independence
  reason given above", trimmed it to "not combined into a pooled
  random-effects estimate; … presented group by group", removing the
  duplicate representative definition.
Reassembled and rebuilt the docx; crosscheck A-H all pass.

Co-Authored-By: Claude Opus 4.8 <noreply@anthropic.com>
Claude-Session: https://claude.ai/code/session_01CuLT4FKRBtsU22Vwfjj2qn
</commit_message>
<xml_diff>
--- a/meta_agents/search_v2/outputs/Manuscript_Full.docx
+++ b/meta_agents/search_v2/outputs/Manuscript_Full.docx
@@ -756,7 +756,7 @@
           <w:sz w:val="24"/>
           <w:szCs w:val="24"/>
         </w:rPr>
-        <w:t xml:space="preserve">For AI/AN populations this order was overridden in favour of ascertainment validity: because unlinked registries tend to undercount this population, an estimate with Indian Health Service–based ascertainment—the IHS-PRCDA linkage, or a dedicated registry such as the Alaska Native Tumor Registry—was preferred over an unlinked-registry estimate for the same cell; this ascertainment preference took priority over the coverage and comparator-type criteria above. For Alaska Native women, for example, this ascertainment-preferred source—the IHS-eligibility-based Alaska Native Tumor Registry—reports against an unstratified White reference rather than NHW; it was kept as the representative because completeness of ascertainment took priority over comparator type, and its NHW-comparator alternative was carried in the sensitivity analysis.</w:t>
+        <w:t xml:space="preserve">For AI/AN populations this order was overridden in favour of ascertainment validity: because unlinked registries tend to undercount this population, an estimate with Indian Health Service–based ascertainment—the IHS-PRCDA linkage, or a dedicated registry such as the Alaska Native Tumor Registry—was preferred over an unlinked-registry estimate for the same cell; this ascertainment preference took priority over the coverage and comparator-type criteria above. Alaska Native women are an example. The ascertainment-preferred source—the IHS-eligibility-based Alaska Native Tumor Registry—reports against an unstratified White reference rather than NHW. It was kept as the representative because completeness of ascertainment outweighed comparator type, and the NHW-comparator alternatives were carried in the sensitivity analysis.</w:t>
       </w:r>
     </w:p>
     <w:p>
@@ -872,7 +872,7 @@
           <w:sz w:val="24"/>
           <w:szCs w:val="24"/>
         </w:rPr>
-        <w:t xml:space="preserve">, its source having reported no in-paper White comparator; it was retained only as an overlap record, not as a representative. For the non-independence reason given above, these estimates were not combined into a pooled random-effects estimate; the primary result for each group is the representative population-based estimate, and the analysis presents the racial and ethnic differences and the subgroup heterogeneity group by group rather than as a single pooled value. Studies that met the inclusion criteria but did not provide a recoverable NHW comparison were not placed on the IRR scale; these were summarized narratively by racial or ethnic group and outcome. Analyses were carried out in Python 3 using SciPy.</w:t>
+        <w:t xml:space="preserve">, its source having reported no in-paper White comparator; it was retained only as an overlap record, not as a representative. For the non-independence reason given above, these estimates were not combined into a pooled random-effects estimate; the racial and ethnic differences and the subgroup heterogeneity are presented group by group rather than as a single pooled value. Studies that met the inclusion criteria but did not provide a recoverable NHW comparison were not placed on the IRR scale; these were summarized narratively by racial or ethnic group and outcome. Analyses were carried out in Python 3 using SciPy.</w:t>
       </w:r>
     </w:p>
     <w:p>

</xml_diff>

<commit_message>
Break up the 419-word paragraph in the Discussion
It paired "First, unlinked registries tend to undercount AI/AN cases"
with "Second, reference groups differed across sources", but the first
limb ran 368 words and the second 51. Nothing reads as a pair at that
ratio — by the time "Second" arrives the reader has lost "First".

Split it three ways along the joins already in the text: the ascertainment
gap between the two national AI/AN figures and what explains it; what
follows for this review's AI/AN estimates, from the rise over time to the
absence of a linked source by subtype; and the comparator point, which is
about a different feature of the data and now stands on its own. The
opening sentence names both features instead of numbering them.

Paragraph lengths across the Discussion are now 93 to 293 words rather
than 52 to 419.

Co-Authored-By: Claude Opus 5 <noreply@anthropic.com>
Claude-Session: https://claude.ai/code/session_01CuLT4FKRBtsU22Vwfjj2qn
</commit_message>
<xml_diff>
--- a/meta_agents/search_v2/outputs/Manuscript_Full.docx
+++ b/meta_agents/search_v2/outputs/Manuscript_Full.docx
@@ -1554,7 +1554,7 @@
           <w:sz w:val="24"/>
           <w:szCs w:val="24"/>
         </w:rPr>
-        <w:t xml:space="preserve">Two features of the underlying data shaped these estimates. First, unlinked registries tend to undercount AI/AN cases, so the AI/AN estimates here draw on Indian Health Service–linked sources, which capture these cases more completely.</w:t>
+        <w:t xml:space="preserve">Two features of the underlying data shaped these estimates: how AI/AN cases were ascertained, and which White group each source compared against. Unlinked registries tend to undercount AI/AN cases, so the AI/AN estimates here draw on Indian Health Service–linked sources, which capture these cases more completely.</w:t>
       </w:r>
       <w:r>
         <w:rPr>
@@ -1592,7 +1592,21 @@
           <w:sz w:val="24"/>
           <w:szCs w:val="24"/>
         </w:rPr>
-        <w:t xml:space="preserve"> so the IHS-linked figures describe about half of this population rather than the whole of it, and the better-covered regions are those where AI/AN residents make up a larger share of the county population. Only the third difference—how AI/AN race was ascertained—is the linkage itself. Among IHS-linked national estimates the ratio also rose over time, from 0.63 in 1999–2004 to 0.87 in 2010–2015, so the most recent IHS-linked estimate was taken as the representative and the earlier one retained for sensitivity. The IHS-linked regional estimates vary widely and reach or exceed the NHW rate in the Northern and Southern Plains—and, against an unstratified White reference, among Alaska Native women (regional values in Table 1 and Figure 2). The lower unlinked values therefore likely reflect incomplete case ascertainment, together with the wider diagnosis periods and the national rather than PRCDA coverage of those sources, rather than only lower underlying incidence; the AI/AN–NHW comparison therefore depends on the source's ascertainment as well as its diagnosis period and geographic scope.</w:t>
+        <w:t xml:space="preserve"> so the IHS-linked figures describe about half of this population rather than the whole of it, and the better-covered regions are those where AI/AN residents make up a larger share of the county population. Only the third difference—how AI/AN race was ascertained—is the linkage itself.</w:t>
+      </w:r>
+    </w:p>
+    <w:p>
+      <w:pPr>
+        <w:spacing w:after="160" w:line="360"/>
+      </w:pPr>
+      <w:r>
+        <w:rPr>
+          <w:rFonts w:ascii="Times New Roman" w:cs="Times New Roman" w:eastAsia="Times New Roman" w:hAnsi="Times New Roman"/>
+          <w:color w:val="000000"/>
+          <w:sz w:val="24"/>
+          <w:szCs w:val="24"/>
+        </w:rPr>
+        <w:t xml:space="preserve">Among IHS-linked national estimates the ratio also rose over time, from 0.63 in 1999–2004 to 0.87 in 2010–2015, so the most recent IHS-linked estimate was taken as the representative and the earlier one retained for sensitivity. The IHS-linked regional estimates vary widely and reach or exceed the NHW rate in the Northern and Southern Plains—and, against an unstratified White reference, among Alaska Native women (regional values in Table 1 and Figure 2). The lower unlinked values therefore likely reflect incomplete case ascertainment, together with the wider diagnosis periods and the national rather than PRCDA coverage of those sources, rather than only lower underlying incidence; the AI/AN–NHW comparison therefore depends on the source's ascertainment as well as its diagnosis period and geographic scope.</w:t>
       </w:r>
       <w:r>
         <w:rPr>
@@ -1611,7 +1625,21 @@
           <w:sz w:val="24"/>
           <w:szCs w:val="24"/>
         </w:rPr>
-        <w:t xml:space="preserve"> The IHS-linked correction, however, was available only for the aggregate and regional estimates: no Indian Health Service–linked source reported AI/AN incidence by molecular subtype, so the AI/AN subtype figures (for example, the HR-positive/HER2-negative and triple-negative cells) rest on unlinked registries and may understate the true rates. Second, reference groups differed across sources—66 of the 85 representatives used an NHW comparator and 19 an unstratified White reference—so each comparator was recorded as its source defined it and a sensitivity analysis was restricted to NHW-comparator estimates; the unstratified-White cells, 16 of them receptor-defined subtypes, can shift a ratio slightly.</w:t>
+        <w:t xml:space="preserve"> The IHS-linked correction, however, was available only for the aggregate and regional estimates: no Indian Health Service–linked source reported AI/AN incidence by molecular subtype, so the AI/AN subtype figures (for example, the HR-positive/HER2-negative and triple-negative cells) rest on unlinked registries and may understate the true rates.</w:t>
+      </w:r>
+    </w:p>
+    <w:p>
+      <w:pPr>
+        <w:spacing w:after="160" w:line="360"/>
+      </w:pPr>
+      <w:r>
+        <w:rPr>
+          <w:rFonts w:ascii="Times New Roman" w:cs="Times New Roman" w:eastAsia="Times New Roman" w:hAnsi="Times New Roman"/>
+          <w:color w:val="000000"/>
+          <w:sz w:val="24"/>
+          <w:szCs w:val="24"/>
+        </w:rPr>
+        <w:t xml:space="preserve">Reference groups also differed across sources—66 of the 85 representatives used an NHW comparator and 19 an unstratified White reference—so each comparator was recorded as its source defined it and a sensitivity analysis was restricted to NHW-comparator estimates; the unstratified-White cells, 16 of them receptor-defined subtypes, can shift a ratio slightly.</w:t>
       </w:r>
     </w:p>
     <w:p>

</xml_diff>